<commit_message>
Add current prototype visuals to revised thesis
</commit_message>
<xml_diff>
--- a/THESIS DOCUMENTATION/PROJECT FALCON-01 - CURRENT V2 REVISED.docx
+++ b/THESIS DOCUMENTATION/PROJECT FALCON-01 - CURRENT V2 REVISED.docx
@@ -8132,172 +8132,206 @@
     </w:p>
     <w:p>
       <w:pPr>
-        <w:rPr>
-          <w:rFonts w:ascii="Times New Roman" w:hAnsi="Times New Roman" w:cs="Times New Roman"/>
-          <w:sz w:val="24"/>
-          <w:szCs w:val="24"/>
-        </w:rPr>
-      </w:pPr>
-      <w:r>
-        <w:rPr>
-          <w:rFonts w:ascii="Times New Roman" w:hAnsi="Times New Roman" w:cs="Times New Roman"/>
-          <w:sz w:val="24"/>
-          <w:szCs w:val="24"/>
-        </w:rPr>
-        <w:t xml:space="preserve">                  SUNLIGHT</w:t>
-      </w:r>
-    </w:p>
-    <w:p>
-      <w:pPr>
-        <w:rPr>
-          <w:rFonts w:ascii="Times New Roman" w:hAnsi="Times New Roman" w:cs="Times New Roman"/>
-          <w:sz w:val="24"/>
-          <w:szCs w:val="24"/>
-        </w:rPr>
-      </w:pPr>
-      <w:r>
-        <w:rPr>
-          <w:rFonts w:ascii="Times New Roman" w:hAnsi="Times New Roman" w:cs="Times New Roman"/>
-          <w:sz w:val="24"/>
-          <w:szCs w:val="24"/>
-        </w:rPr>
-        <w:t xml:space="preserve">                     │</w:t>
-      </w:r>
-    </w:p>
-    <w:p>
-      <w:pPr>
-        <w:rPr>
-          <w:rFonts w:ascii="Times New Roman" w:hAnsi="Times New Roman" w:cs="Times New Roman"/>
-          <w:sz w:val="24"/>
-          <w:szCs w:val="24"/>
-        </w:rPr>
-      </w:pPr>
-      <w:r>
-        <w:rPr>
-          <w:rFonts w:ascii="Times New Roman" w:hAnsi="Times New Roman" w:cs="Times New Roman"/>
-          <w:sz w:val="24"/>
-          <w:szCs w:val="24"/>
-        </w:rPr>
-        <w:t xml:space="preserve">                     ▼</w:t>
-      </w:r>
-    </w:p>
-    <w:p>
-      <w:pPr>
-        <w:rPr>
-          <w:rFonts w:ascii="Times New Roman" w:hAnsi="Times New Roman" w:cs="Times New Roman"/>
-          <w:sz w:val="24"/>
-          <w:szCs w:val="24"/>
-        </w:rPr>
-      </w:pPr>
-      <w:r>
-        <w:rPr>
-          <w:rFonts w:ascii="Times New Roman" w:hAnsi="Times New Roman" w:cs="Times New Roman"/>
-          <w:sz w:val="24"/>
-          <w:szCs w:val="24"/>
-        </w:rPr>
-        <w:t>Two Opposed 30 W Solar Panels</w:t>
-      </w:r>
-    </w:p>
-    <w:p>
-      <w:pPr>
-        <w:rPr>
-          <w:rFonts w:ascii="Times New Roman" w:hAnsi="Times New Roman" w:cs="Times New Roman"/>
-          <w:sz w:val="24"/>
-          <w:szCs w:val="24"/>
-        </w:rPr>
-      </w:pPr>
-      <w:r>
-        <w:rPr>
-          <w:rFonts w:ascii="Times New Roman" w:hAnsi="Times New Roman" w:cs="Times New Roman"/>
-          <w:sz w:val="24"/>
-          <w:szCs w:val="24"/>
-        </w:rPr>
-        <w:t xml:space="preserve">                     │</w:t>
-      </w:r>
-    </w:p>
-    <w:p>
-      <w:pPr>
-        <w:rPr>
-          <w:rFonts w:ascii="Times New Roman" w:hAnsi="Times New Roman" w:cs="Times New Roman"/>
-          <w:sz w:val="24"/>
-          <w:szCs w:val="24"/>
-        </w:rPr>
-      </w:pPr>
-      <w:r>
-        <w:rPr>
-          <w:rFonts w:ascii="Times New Roman" w:hAnsi="Times New Roman" w:cs="Times New Roman"/>
-          <w:sz w:val="24"/>
-          <w:szCs w:val="24"/>
-        </w:rPr>
-        <w:t xml:space="preserve">                     ▼</w:t>
-      </w:r>
-    </w:p>
-    <w:p>
-      <w:pPr>
-        <w:rPr>
-          <w:rFonts w:ascii="Times New Roman" w:hAnsi="Times New Roman" w:cs="Times New Roman"/>
-          <w:sz w:val="24"/>
-          <w:szCs w:val="24"/>
-        </w:rPr>
-      </w:pPr>
-      <w:r>
-        <w:rPr>
-          <w:rFonts w:ascii="Times New Roman" w:hAnsi="Times New Roman" w:cs="Times New Roman"/>
-          <w:sz w:val="24"/>
-          <w:szCs w:val="24"/>
-        </w:rPr>
-        <w:t xml:space="preserve">          MPPT Charge Controller</w:t>
-      </w:r>
-    </w:p>
-    <w:p>
-      <w:pPr>
-        <w:rPr>
-          <w:rFonts w:ascii="Times New Roman" w:hAnsi="Times New Roman" w:cs="Times New Roman"/>
-          <w:sz w:val="24"/>
-          <w:szCs w:val="24"/>
-        </w:rPr>
-      </w:pPr>
-      <w:r>
-        <w:rPr>
-          <w:rFonts w:ascii="Times New Roman" w:hAnsi="Times New Roman" w:cs="Times New Roman"/>
-          <w:sz w:val="24"/>
-          <w:szCs w:val="24"/>
-        </w:rPr>
-        <w:t xml:space="preserve">                     │</w:t>
-      </w:r>
-    </w:p>
-    <w:p>
-      <w:pPr>
-        <w:rPr>
-          <w:rFonts w:ascii="Times New Roman" w:hAnsi="Times New Roman" w:cs="Times New Roman"/>
-          <w:sz w:val="24"/>
-          <w:szCs w:val="24"/>
-        </w:rPr>
-      </w:pPr>
-      <w:r>
-        <w:rPr>
-          <w:rFonts w:ascii="Times New Roman" w:hAnsi="Times New Roman" w:cs="Times New Roman"/>
-          <w:sz w:val="24"/>
-          <w:szCs w:val="24"/>
-        </w:rPr>
-        <w:t xml:space="preserve">                     ▼</w:t>
-      </w:r>
-    </w:p>
-    <w:p>
-      <w:pPr>
-        <w:rPr>
-          <w:rFonts w:ascii="Times New Roman" w:hAnsi="Times New Roman" w:cs="Times New Roman"/>
-          <w:sz w:val="24"/>
-          <w:szCs w:val="24"/>
-        </w:rPr>
-      </w:pPr>
-      <w:r>
-        <w:rPr>
-          <w:rFonts w:ascii="Times New Roman" w:hAnsi="Times New Roman" w:cs="Times New Roman"/>
-          <w:sz w:val="24"/>
-          <w:szCs w:val="24"/>
-        </w:rPr>
-        <w:t xml:space="preserve">           12V </w:t>
+        <w:jc w:val="center"/>
+        <w:rPr>
+          <w:rFonts w:ascii="Times New Roman" w:hAnsi="Times New Roman" w:cs="Times New Roman"/>
+          <w:sz w:val="24"/>
+          <w:szCs w:val="24"/>
+        </w:rPr>
+      </w:pPr>
+      <w:r>
+        <w:rPr>
+          <w:rFonts w:ascii="Times New Roman" w:hAnsi="Times New Roman" w:cs="Times New Roman"/>
+          <w:sz w:val="24"/>
+          <w:szCs w:val="24"/>
+        </w:rPr>
+      </w:r>
+      <w:r>
+        <w:drawing>
+          <wp:inline xmlns:a="http://schemas.openxmlformats.org/drawingml/2006/main" xmlns:pic="http://schemas.openxmlformats.org/drawingml/2006/picture">
+            <wp:extent cx="5715000" cy="2941124"/>
+            <wp:docPr id="1" name="Picture 1"/>
+            <wp:cNvGraphicFramePr>
+              <a:graphicFrameLocks noChangeAspect="1"/>
+            </wp:cNvGraphicFramePr>
+            <a:graphic>
+              <a:graphicData uri="http://schemas.openxmlformats.org/drawingml/2006/picture">
+                <pic:pic>
+                  <pic:nvPicPr>
+                    <pic:cNvPr id="0" name="system-architecture.png"/>
+                    <pic:cNvPicPr/>
+                  </pic:nvPicPr>
+                  <pic:blipFill>
+                    <a:blip r:embed="rId11"/>
+                    <a:stretch>
+                      <a:fillRect/>
+                    </a:stretch>
+                  </pic:blipFill>
+                  <pic:spPr>
+                    <a:xfrm>
+                      <a:off x="0" y="0"/>
+                      <a:ext cx="5715000" cy="2941124"/>
+                    </a:xfrm>
+                    <a:prstGeom prst="rect"/>
+                  </pic:spPr>
+                </pic:pic>
+              </a:graphicData>
+            </a:graphic>
+          </wp:inline>
+        </w:drawing>
+      </w:r>
+      <w:r>
+        <w:rPr>
+          <w:b/>
+          <w:i/>
+          <w:sz w:val="18"/>
+        </w:rPr>
+        <w:br/>
+        <w:t>Figure 1. Current local-first workflow: sensing, ESP32 acquisition, Orange Pi edge processing, and dashboard presentation.</w:t>
+      </w:r>
+    </w:p>
+    <w:p>
+      <w:pPr>
+        <w:rPr>
+          <w:rFonts w:ascii="Times New Roman" w:hAnsi="Times New Roman" w:cs="Times New Roman"/>
+          <w:sz w:val="24"/>
+          <w:szCs w:val="24"/>
+        </w:rPr>
+      </w:pPr>
+      <w:r>
+        <w:rPr>
+          <w:rFonts w:ascii="Times New Roman" w:hAnsi="Times New Roman" w:cs="Times New Roman"/>
+          <w:sz w:val="24"/>
+          <w:szCs w:val="24"/>
+        </w:rPr>
+      </w:r>
+    </w:p>
+    <w:p>
+      <w:pPr>
+        <w:rPr>
+          <w:rFonts w:ascii="Times New Roman" w:hAnsi="Times New Roman" w:cs="Times New Roman"/>
+          <w:sz w:val="24"/>
+          <w:szCs w:val="24"/>
+        </w:rPr>
+      </w:pPr>
+      <w:r>
+        <w:rPr>
+          <w:rFonts w:ascii="Times New Roman" w:hAnsi="Times New Roman" w:cs="Times New Roman"/>
+          <w:sz w:val="24"/>
+          <w:szCs w:val="24"/>
+        </w:rPr>
+      </w:r>
+    </w:p>
+    <w:p>
+      <w:pPr>
+        <w:rPr>
+          <w:rFonts w:ascii="Times New Roman" w:hAnsi="Times New Roman" w:cs="Times New Roman"/>
+          <w:sz w:val="24"/>
+          <w:szCs w:val="24"/>
+        </w:rPr>
+      </w:pPr>
+      <w:r>
+        <w:rPr>
+          <w:rFonts w:ascii="Times New Roman" w:hAnsi="Times New Roman" w:cs="Times New Roman"/>
+          <w:sz w:val="24"/>
+          <w:szCs w:val="24"/>
+        </w:rPr>
+      </w:r>
+    </w:p>
+    <w:p>
+      <w:pPr>
+        <w:rPr>
+          <w:rFonts w:ascii="Times New Roman" w:hAnsi="Times New Roman" w:cs="Times New Roman"/>
+          <w:sz w:val="24"/>
+          <w:szCs w:val="24"/>
+        </w:rPr>
+      </w:pPr>
+      <w:r>
+        <w:rPr>
+          <w:rFonts w:ascii="Times New Roman" w:hAnsi="Times New Roman" w:cs="Times New Roman"/>
+          <w:sz w:val="24"/>
+          <w:szCs w:val="24"/>
+        </w:rPr>
+      </w:r>
+    </w:p>
+    <w:p>
+      <w:pPr>
+        <w:rPr>
+          <w:rFonts w:ascii="Times New Roman" w:hAnsi="Times New Roman" w:cs="Times New Roman"/>
+          <w:sz w:val="24"/>
+          <w:szCs w:val="24"/>
+        </w:rPr>
+      </w:pPr>
+      <w:r>
+        <w:rPr>
+          <w:rFonts w:ascii="Times New Roman" w:hAnsi="Times New Roman" w:cs="Times New Roman"/>
+          <w:sz w:val="24"/>
+          <w:szCs w:val="24"/>
+        </w:rPr>
+      </w:r>
+    </w:p>
+    <w:p>
+      <w:pPr>
+        <w:rPr>
+          <w:rFonts w:ascii="Times New Roman" w:hAnsi="Times New Roman" w:cs="Times New Roman"/>
+          <w:sz w:val="24"/>
+          <w:szCs w:val="24"/>
+        </w:rPr>
+      </w:pPr>
+      <w:r>
+        <w:rPr>
+          <w:rFonts w:ascii="Times New Roman" w:hAnsi="Times New Roman" w:cs="Times New Roman"/>
+          <w:sz w:val="24"/>
+          <w:szCs w:val="24"/>
+        </w:rPr>
+      </w:r>
+    </w:p>
+    <w:p>
+      <w:pPr>
+        <w:rPr>
+          <w:rFonts w:ascii="Times New Roman" w:hAnsi="Times New Roman" w:cs="Times New Roman"/>
+          <w:sz w:val="24"/>
+          <w:szCs w:val="24"/>
+        </w:rPr>
+      </w:pPr>
+      <w:r>
+        <w:rPr>
+          <w:rFonts w:ascii="Times New Roman" w:hAnsi="Times New Roman" w:cs="Times New Roman"/>
+          <w:sz w:val="24"/>
+          <w:szCs w:val="24"/>
+        </w:rPr>
+      </w:r>
+    </w:p>
+    <w:p>
+      <w:pPr>
+        <w:rPr>
+          <w:rFonts w:ascii="Times New Roman" w:hAnsi="Times New Roman" w:cs="Times New Roman"/>
+          <w:sz w:val="24"/>
+          <w:szCs w:val="24"/>
+        </w:rPr>
+      </w:pPr>
+      <w:r>
+        <w:rPr>
+          <w:rFonts w:ascii="Times New Roman" w:hAnsi="Times New Roman" w:cs="Times New Roman"/>
+          <w:sz w:val="24"/>
+          <w:szCs w:val="24"/>
+        </w:rPr>
+      </w:r>
+    </w:p>
+    <w:p>
+      <w:pPr>
+        <w:rPr>
+          <w:rFonts w:ascii="Times New Roman" w:hAnsi="Times New Roman" w:cs="Times New Roman"/>
+          <w:sz w:val="24"/>
+          <w:szCs w:val="24"/>
+        </w:rPr>
+      </w:pPr>
+      <w:r>
+        <w:rPr>
+          <w:rFonts w:ascii="Times New Roman" w:hAnsi="Times New Roman" w:cs="Times New Roman"/>
+          <w:sz w:val="24"/>
+          <w:szCs w:val="24"/>
+        </w:rPr>
       </w:r>
       <w:proofErr w:type="spellStart"/>
       <w:r>
@@ -8306,7 +8340,6 @@
           <w:sz w:val="24"/>
           <w:szCs w:val="24"/>
         </w:rPr>
-        <w:t>LiFePO</w:t>
       </w:r>
       <w:proofErr w:type="spellEnd"/>
       <w:r>
@@ -8315,381 +8348,358 @@
           <w:sz w:val="24"/>
           <w:szCs w:val="24"/>
         </w:rPr>
-        <w:t>₄ Battery</w:t>
-      </w:r>
-    </w:p>
-    <w:p>
-      <w:pPr>
-        <w:rPr>
-          <w:rFonts w:ascii="Times New Roman" w:hAnsi="Times New Roman" w:cs="Times New Roman"/>
-          <w:sz w:val="24"/>
-          <w:szCs w:val="24"/>
-        </w:rPr>
-      </w:pPr>
-      <w:r>
-        <w:rPr>
-          <w:rFonts w:ascii="Times New Roman" w:hAnsi="Times New Roman" w:cs="Times New Roman"/>
-          <w:sz w:val="24"/>
-          <w:szCs w:val="24"/>
-        </w:rPr>
-        <w:t xml:space="preserve">                     │</w:t>
-      </w:r>
-    </w:p>
-    <w:p>
-      <w:pPr>
-        <w:rPr>
-          <w:rFonts w:ascii="Times New Roman" w:hAnsi="Times New Roman" w:cs="Times New Roman"/>
-          <w:sz w:val="24"/>
-          <w:szCs w:val="24"/>
-        </w:rPr>
-      </w:pPr>
-      <w:r>
-        <w:rPr>
-          <w:rFonts w:ascii="Times New Roman" w:hAnsi="Times New Roman" w:cs="Times New Roman"/>
-          <w:sz w:val="24"/>
-          <w:szCs w:val="24"/>
-        </w:rPr>
-        <w:t xml:space="preserve">      ┌──────────────┴──────────────┐</w:t>
-      </w:r>
-    </w:p>
-    <w:p>
-      <w:pPr>
-        <w:rPr>
-          <w:rFonts w:ascii="Times New Roman" w:hAnsi="Times New Roman" w:cs="Times New Roman"/>
-          <w:sz w:val="24"/>
-          <w:szCs w:val="24"/>
-        </w:rPr>
-      </w:pPr>
-      <w:r>
-        <w:rPr>
-          <w:rFonts w:ascii="Times New Roman" w:hAnsi="Times New Roman" w:cs="Times New Roman"/>
-          <w:sz w:val="24"/>
-          <w:szCs w:val="24"/>
-        </w:rPr>
-        <w:t xml:space="preserve">      ▼                             ▼</w:t>
-      </w:r>
-    </w:p>
-    <w:p>
-      <w:pPr>
-        <w:rPr>
-          <w:rFonts w:ascii="Times New Roman" w:hAnsi="Times New Roman" w:cs="Times New Roman"/>
-          <w:sz w:val="24"/>
-          <w:szCs w:val="24"/>
-        </w:rPr>
-      </w:pPr>
-      <w:r>
-        <w:rPr>
-          <w:rFonts w:ascii="Times New Roman" w:hAnsi="Times New Roman" w:cs="Times New Roman"/>
-          <w:sz w:val="24"/>
-          <w:szCs w:val="24"/>
-        </w:rPr>
-        <w:t>ESP32 Controller              Orange Pi Zero 3 (Edge AI)</w:t>
-      </w:r>
-    </w:p>
-    <w:p>
-      <w:pPr>
-        <w:rPr>
-          <w:rFonts w:ascii="Times New Roman" w:hAnsi="Times New Roman" w:cs="Times New Roman"/>
-          <w:sz w:val="24"/>
-          <w:szCs w:val="24"/>
-        </w:rPr>
-      </w:pPr>
-      <w:r>
-        <w:rPr>
-          <w:rFonts w:ascii="Times New Roman" w:hAnsi="Times New Roman" w:cs="Times New Roman"/>
-          <w:sz w:val="24"/>
-          <w:szCs w:val="24"/>
-        </w:rPr>
-        <w:t xml:space="preserve">      │                             │</w:t>
-      </w:r>
-    </w:p>
-    <w:p>
-      <w:pPr>
-        <w:rPr>
-          <w:rFonts w:ascii="Times New Roman" w:hAnsi="Times New Roman" w:cs="Times New Roman"/>
-          <w:sz w:val="24"/>
-          <w:szCs w:val="24"/>
-        </w:rPr>
-      </w:pPr>
-      <w:r>
-        <w:rPr>
-          <w:rFonts w:ascii="Times New Roman" w:hAnsi="Times New Roman" w:cs="Times New Roman"/>
-          <w:sz w:val="24"/>
-          <w:szCs w:val="24"/>
-        </w:rPr>
-        <w:t xml:space="preserve">      ├──────────────┐              │</w:t>
-      </w:r>
-    </w:p>
-    <w:p>
-      <w:pPr>
-        <w:rPr>
-          <w:rFonts w:ascii="Times New Roman" w:hAnsi="Times New Roman" w:cs="Times New Roman"/>
-          <w:sz w:val="24"/>
-          <w:szCs w:val="24"/>
-        </w:rPr>
-      </w:pPr>
-      <w:r>
-        <w:rPr>
-          <w:rFonts w:ascii="Times New Roman" w:hAnsi="Times New Roman" w:cs="Times New Roman"/>
-          <w:sz w:val="24"/>
-          <w:szCs w:val="24"/>
-        </w:rPr>
-        <w:t xml:space="preserve">      ▼              ▼              ▼</w:t>
-      </w:r>
-    </w:p>
-    <w:p>
-      <w:pPr>
-        <w:rPr>
-          <w:rFonts w:ascii="Times New Roman" w:hAnsi="Times New Roman" w:cs="Times New Roman"/>
-          <w:sz w:val="24"/>
-          <w:szCs w:val="24"/>
-        </w:rPr>
-      </w:pPr>
-      <w:r>
-        <w:rPr>
-          <w:rFonts w:ascii="Times New Roman" w:hAnsi="Times New Roman" w:cs="Times New Roman"/>
-          <w:sz w:val="24"/>
-          <w:szCs w:val="24"/>
-        </w:rPr>
-        <w:t xml:space="preserve"> Environmental    Power       AI Processing</w:t>
-      </w:r>
-    </w:p>
-    <w:p>
-      <w:pPr>
-        <w:rPr>
-          <w:rFonts w:ascii="Times New Roman" w:hAnsi="Times New Roman" w:cs="Times New Roman"/>
-          <w:sz w:val="24"/>
-          <w:szCs w:val="24"/>
-        </w:rPr>
-      </w:pPr>
-      <w:r>
-        <w:rPr>
-          <w:rFonts w:ascii="Times New Roman" w:hAnsi="Times New Roman" w:cs="Times New Roman"/>
-          <w:sz w:val="24"/>
-          <w:szCs w:val="24"/>
-        </w:rPr>
-        <w:t xml:space="preserve"> Sensors          Monitor     Prediction Engine</w:t>
-      </w:r>
-    </w:p>
-    <w:p>
-      <w:pPr>
-        <w:rPr>
-          <w:rFonts w:ascii="Times New Roman" w:hAnsi="Times New Roman" w:cs="Times New Roman"/>
-          <w:sz w:val="24"/>
-          <w:szCs w:val="24"/>
-        </w:rPr>
-      </w:pPr>
-      <w:r>
-        <w:rPr>
-          <w:rFonts w:ascii="Times New Roman" w:hAnsi="Times New Roman" w:cs="Times New Roman"/>
-          <w:sz w:val="24"/>
-          <w:szCs w:val="24"/>
-        </w:rPr>
-        <w:t xml:space="preserve">      │              │              │</w:t>
-      </w:r>
-    </w:p>
-    <w:p>
-      <w:pPr>
-        <w:rPr>
-          <w:rFonts w:ascii="Times New Roman" w:hAnsi="Times New Roman" w:cs="Times New Roman"/>
-          <w:sz w:val="24"/>
-          <w:szCs w:val="24"/>
-        </w:rPr>
-      </w:pPr>
-      <w:r>
-        <w:rPr>
-          <w:rFonts w:ascii="Times New Roman" w:hAnsi="Times New Roman" w:cs="Times New Roman"/>
-          <w:sz w:val="24"/>
-          <w:szCs w:val="24"/>
-        </w:rPr>
-        <w:t xml:space="preserve">      └───────┬──────┴──────┬───────┘</w:t>
-      </w:r>
-    </w:p>
-    <w:p>
-      <w:pPr>
-        <w:rPr>
-          <w:rFonts w:ascii="Times New Roman" w:hAnsi="Times New Roman" w:cs="Times New Roman"/>
-          <w:sz w:val="24"/>
-          <w:szCs w:val="24"/>
-        </w:rPr>
-      </w:pPr>
-      <w:r>
-        <w:rPr>
-          <w:rFonts w:ascii="Times New Roman" w:hAnsi="Times New Roman" w:cs="Times New Roman"/>
-          <w:sz w:val="24"/>
-          <w:szCs w:val="24"/>
-        </w:rPr>
-        <w:t xml:space="preserve">              ▼             ▼</w:t>
-      </w:r>
-    </w:p>
-    <w:p>
-      <w:pPr>
-        <w:rPr>
-          <w:rFonts w:ascii="Times New Roman" w:hAnsi="Times New Roman" w:cs="Times New Roman"/>
-          <w:sz w:val="24"/>
-          <w:szCs w:val="24"/>
-        </w:rPr>
-      </w:pPr>
-      <w:r>
-        <w:rPr>
-          <w:rFonts w:ascii="Times New Roman" w:hAnsi="Times New Roman" w:cs="Times New Roman"/>
-          <w:sz w:val="24"/>
-          <w:szCs w:val="24"/>
-        </w:rPr>
-        <w:t xml:space="preserve">         Local Database / Memory</w:t>
-      </w:r>
-    </w:p>
-    <w:p>
-      <w:pPr>
-        <w:rPr>
-          <w:rFonts w:ascii="Times New Roman" w:hAnsi="Times New Roman" w:cs="Times New Roman"/>
-          <w:sz w:val="24"/>
-          <w:szCs w:val="24"/>
-        </w:rPr>
-      </w:pPr>
-      <w:r>
-        <w:rPr>
-          <w:rFonts w:ascii="Times New Roman" w:hAnsi="Times New Roman" w:cs="Times New Roman"/>
-          <w:sz w:val="24"/>
-          <w:szCs w:val="24"/>
-        </w:rPr>
-        <w:t xml:space="preserve">              │</w:t>
-      </w:r>
-    </w:p>
-    <w:p>
-      <w:pPr>
-        <w:rPr>
-          <w:rFonts w:ascii="Times New Roman" w:hAnsi="Times New Roman" w:cs="Times New Roman"/>
-          <w:sz w:val="24"/>
-          <w:szCs w:val="24"/>
-        </w:rPr>
-      </w:pPr>
-      <w:r>
-        <w:rPr>
-          <w:rFonts w:ascii="Times New Roman" w:hAnsi="Times New Roman" w:cs="Times New Roman"/>
-          <w:sz w:val="24"/>
-          <w:szCs w:val="24"/>
-        </w:rPr>
-        <w:t xml:space="preserve">              ▼</w:t>
-      </w:r>
-    </w:p>
-    <w:p>
-      <w:pPr>
-        <w:rPr>
-          <w:rFonts w:ascii="Times New Roman" w:hAnsi="Times New Roman" w:cs="Times New Roman"/>
-          <w:sz w:val="24"/>
-          <w:szCs w:val="24"/>
-        </w:rPr>
-      </w:pPr>
-      <w:r>
-        <w:rPr>
-          <w:rFonts w:ascii="Times New Roman" w:hAnsi="Times New Roman" w:cs="Times New Roman"/>
-          <w:sz w:val="24"/>
-          <w:szCs w:val="24"/>
-        </w:rPr>
-        <w:t xml:space="preserve">        Local REST API</w:t>
-      </w:r>
-    </w:p>
-    <w:p>
-      <w:pPr>
-        <w:rPr>
-          <w:rFonts w:ascii="Times New Roman" w:hAnsi="Times New Roman" w:cs="Times New Roman"/>
-          <w:sz w:val="24"/>
-          <w:szCs w:val="24"/>
-        </w:rPr>
-      </w:pPr>
-      <w:r>
-        <w:rPr>
-          <w:rFonts w:ascii="Times New Roman" w:hAnsi="Times New Roman" w:cs="Times New Roman"/>
-          <w:sz w:val="24"/>
-          <w:szCs w:val="24"/>
-        </w:rPr>
-        <w:t xml:space="preserve">              │</w:t>
-      </w:r>
-    </w:p>
-    <w:p>
-      <w:pPr>
-        <w:rPr>
-          <w:rFonts w:ascii="Times New Roman" w:hAnsi="Times New Roman" w:cs="Times New Roman"/>
-          <w:sz w:val="24"/>
-          <w:szCs w:val="24"/>
-        </w:rPr>
-      </w:pPr>
-      <w:r>
-        <w:rPr>
-          <w:rFonts w:ascii="Times New Roman" w:hAnsi="Times New Roman" w:cs="Times New Roman"/>
-          <w:sz w:val="24"/>
-          <w:szCs w:val="24"/>
-        </w:rPr>
-        <w:t xml:space="preserve">              ▼</w:t>
-      </w:r>
-    </w:p>
-    <w:p>
-      <w:pPr>
-        <w:rPr>
-          <w:rFonts w:ascii="Times New Roman" w:hAnsi="Times New Roman" w:cs="Times New Roman"/>
-          <w:sz w:val="24"/>
-          <w:szCs w:val="24"/>
-        </w:rPr>
-      </w:pPr>
-      <w:r>
-        <w:rPr>
-          <w:rFonts w:ascii="Times New Roman" w:hAnsi="Times New Roman" w:cs="Times New Roman"/>
-          <w:sz w:val="24"/>
-          <w:szCs w:val="24"/>
-        </w:rPr>
-        <w:t xml:space="preserve">      Responsive Web Dashboard</w:t>
-      </w:r>
-    </w:p>
-    <w:p>
-      <w:pPr>
-        <w:rPr>
-          <w:rFonts w:ascii="Times New Roman" w:hAnsi="Times New Roman" w:cs="Times New Roman"/>
-          <w:sz w:val="24"/>
-          <w:szCs w:val="24"/>
-        </w:rPr>
-      </w:pPr>
-      <w:r>
-        <w:rPr>
-          <w:rFonts w:ascii="Times New Roman" w:hAnsi="Times New Roman" w:cs="Times New Roman"/>
-          <w:sz w:val="24"/>
-          <w:szCs w:val="24"/>
-        </w:rPr>
-        <w:t xml:space="preserve">              │</w:t>
-      </w:r>
-    </w:p>
-    <w:p>
-      <w:pPr>
-        <w:rPr>
-          <w:rFonts w:ascii="Times New Roman" w:hAnsi="Times New Roman" w:cs="Times New Roman"/>
-          <w:sz w:val="24"/>
-          <w:szCs w:val="24"/>
-        </w:rPr>
-      </w:pPr>
-      <w:r>
-        <w:rPr>
-          <w:rFonts w:ascii="Times New Roman" w:hAnsi="Times New Roman" w:cs="Times New Roman"/>
-          <w:sz w:val="24"/>
-          <w:szCs w:val="24"/>
-        </w:rPr>
-        <w:t xml:space="preserve">              ▼</w:t>
-      </w:r>
-    </w:p>
-    <w:p>
-      <w:pPr>
-        <w:rPr>
-          <w:rFonts w:ascii="Times New Roman" w:hAnsi="Times New Roman" w:cs="Times New Roman"/>
-          <w:sz w:val="24"/>
-          <w:szCs w:val="24"/>
-        </w:rPr>
-      </w:pPr>
-      <w:r>
-        <w:rPr>
-          <w:rFonts w:ascii="Times New Roman" w:hAnsi="Times New Roman" w:cs="Times New Roman"/>
-          <w:sz w:val="24"/>
-          <w:szCs w:val="24"/>
-        </w:rPr>
-        <w:t xml:space="preserve">   User (Laptop / Phone / Tablet)</w:t>
+      </w:r>
+    </w:p>
+    <w:p>
+      <w:pPr>
+        <w:rPr>
+          <w:rFonts w:ascii="Times New Roman" w:hAnsi="Times New Roman" w:cs="Times New Roman"/>
+          <w:sz w:val="24"/>
+          <w:szCs w:val="24"/>
+        </w:rPr>
+      </w:pPr>
+      <w:r>
+        <w:rPr>
+          <w:rFonts w:ascii="Times New Roman" w:hAnsi="Times New Roman" w:cs="Times New Roman"/>
+          <w:sz w:val="24"/>
+          <w:szCs w:val="24"/>
+        </w:rPr>
+      </w:r>
+    </w:p>
+    <w:p>
+      <w:pPr>
+        <w:rPr>
+          <w:rFonts w:ascii="Times New Roman" w:hAnsi="Times New Roman" w:cs="Times New Roman"/>
+          <w:sz w:val="24"/>
+          <w:szCs w:val="24"/>
+        </w:rPr>
+      </w:pPr>
+      <w:r>
+        <w:rPr>
+          <w:rFonts w:ascii="Times New Roman" w:hAnsi="Times New Roman" w:cs="Times New Roman"/>
+          <w:sz w:val="24"/>
+          <w:szCs w:val="24"/>
+        </w:rPr>
+      </w:r>
+    </w:p>
+    <w:p>
+      <w:pPr>
+        <w:rPr>
+          <w:rFonts w:ascii="Times New Roman" w:hAnsi="Times New Roman" w:cs="Times New Roman"/>
+          <w:sz w:val="24"/>
+          <w:szCs w:val="24"/>
+        </w:rPr>
+      </w:pPr>
+      <w:r>
+        <w:rPr>
+          <w:rFonts w:ascii="Times New Roman" w:hAnsi="Times New Roman" w:cs="Times New Roman"/>
+          <w:sz w:val="24"/>
+          <w:szCs w:val="24"/>
+        </w:rPr>
+      </w:r>
+    </w:p>
+    <w:p>
+      <w:pPr>
+        <w:rPr>
+          <w:rFonts w:ascii="Times New Roman" w:hAnsi="Times New Roman" w:cs="Times New Roman"/>
+          <w:sz w:val="24"/>
+          <w:szCs w:val="24"/>
+        </w:rPr>
+      </w:pPr>
+      <w:r>
+        <w:rPr>
+          <w:rFonts w:ascii="Times New Roman" w:hAnsi="Times New Roman" w:cs="Times New Roman"/>
+          <w:sz w:val="24"/>
+          <w:szCs w:val="24"/>
+        </w:rPr>
+      </w:r>
+    </w:p>
+    <w:p>
+      <w:pPr>
+        <w:rPr>
+          <w:rFonts w:ascii="Times New Roman" w:hAnsi="Times New Roman" w:cs="Times New Roman"/>
+          <w:sz w:val="24"/>
+          <w:szCs w:val="24"/>
+        </w:rPr>
+      </w:pPr>
+      <w:r>
+        <w:rPr>
+          <w:rFonts w:ascii="Times New Roman" w:hAnsi="Times New Roman" w:cs="Times New Roman"/>
+          <w:sz w:val="24"/>
+          <w:szCs w:val="24"/>
+        </w:rPr>
+      </w:r>
+    </w:p>
+    <w:p>
+      <w:pPr>
+        <w:rPr>
+          <w:rFonts w:ascii="Times New Roman" w:hAnsi="Times New Roman" w:cs="Times New Roman"/>
+          <w:sz w:val="24"/>
+          <w:szCs w:val="24"/>
+        </w:rPr>
+      </w:pPr>
+      <w:r>
+        <w:rPr>
+          <w:rFonts w:ascii="Times New Roman" w:hAnsi="Times New Roman" w:cs="Times New Roman"/>
+          <w:sz w:val="24"/>
+          <w:szCs w:val="24"/>
+        </w:rPr>
+      </w:r>
+    </w:p>
+    <w:p>
+      <w:pPr>
+        <w:rPr>
+          <w:rFonts w:ascii="Times New Roman" w:hAnsi="Times New Roman" w:cs="Times New Roman"/>
+          <w:sz w:val="24"/>
+          <w:szCs w:val="24"/>
+        </w:rPr>
+      </w:pPr>
+      <w:r>
+        <w:rPr>
+          <w:rFonts w:ascii="Times New Roman" w:hAnsi="Times New Roman" w:cs="Times New Roman"/>
+          <w:sz w:val="24"/>
+          <w:szCs w:val="24"/>
+        </w:rPr>
+      </w:r>
+    </w:p>
+    <w:p>
+      <w:pPr>
+        <w:rPr>
+          <w:rFonts w:ascii="Times New Roman" w:hAnsi="Times New Roman" w:cs="Times New Roman"/>
+          <w:sz w:val="24"/>
+          <w:szCs w:val="24"/>
+        </w:rPr>
+      </w:pPr>
+      <w:r>
+        <w:rPr>
+          <w:rFonts w:ascii="Times New Roman" w:hAnsi="Times New Roman" w:cs="Times New Roman"/>
+          <w:sz w:val="24"/>
+          <w:szCs w:val="24"/>
+        </w:rPr>
+      </w:r>
+    </w:p>
+    <w:p>
+      <w:pPr>
+        <w:rPr>
+          <w:rFonts w:ascii="Times New Roman" w:hAnsi="Times New Roman" w:cs="Times New Roman"/>
+          <w:sz w:val="24"/>
+          <w:szCs w:val="24"/>
+        </w:rPr>
+      </w:pPr>
+      <w:r>
+        <w:rPr>
+          <w:rFonts w:ascii="Times New Roman" w:hAnsi="Times New Roman" w:cs="Times New Roman"/>
+          <w:sz w:val="24"/>
+          <w:szCs w:val="24"/>
+        </w:rPr>
+      </w:r>
+    </w:p>
+    <w:p>
+      <w:pPr>
+        <w:rPr>
+          <w:rFonts w:ascii="Times New Roman" w:hAnsi="Times New Roman" w:cs="Times New Roman"/>
+          <w:sz w:val="24"/>
+          <w:szCs w:val="24"/>
+        </w:rPr>
+      </w:pPr>
+      <w:r>
+        <w:rPr>
+          <w:rFonts w:ascii="Times New Roman" w:hAnsi="Times New Roman" w:cs="Times New Roman"/>
+          <w:sz w:val="24"/>
+          <w:szCs w:val="24"/>
+        </w:rPr>
+      </w:r>
+    </w:p>
+    <w:p>
+      <w:pPr>
+        <w:rPr>
+          <w:rFonts w:ascii="Times New Roman" w:hAnsi="Times New Roman" w:cs="Times New Roman"/>
+          <w:sz w:val="24"/>
+          <w:szCs w:val="24"/>
+        </w:rPr>
+      </w:pPr>
+      <w:r>
+        <w:rPr>
+          <w:rFonts w:ascii="Times New Roman" w:hAnsi="Times New Roman" w:cs="Times New Roman"/>
+          <w:sz w:val="24"/>
+          <w:szCs w:val="24"/>
+        </w:rPr>
+      </w:r>
+    </w:p>
+    <w:p>
+      <w:pPr>
+        <w:rPr>
+          <w:rFonts w:ascii="Times New Roman" w:hAnsi="Times New Roman" w:cs="Times New Roman"/>
+          <w:sz w:val="24"/>
+          <w:szCs w:val="24"/>
+        </w:rPr>
+      </w:pPr>
+      <w:r>
+        <w:rPr>
+          <w:rFonts w:ascii="Times New Roman" w:hAnsi="Times New Roman" w:cs="Times New Roman"/>
+          <w:sz w:val="24"/>
+          <w:szCs w:val="24"/>
+        </w:rPr>
+      </w:r>
+    </w:p>
+    <w:p>
+      <w:pPr>
+        <w:rPr>
+          <w:rFonts w:ascii="Times New Roman" w:hAnsi="Times New Roman" w:cs="Times New Roman"/>
+          <w:sz w:val="24"/>
+          <w:szCs w:val="24"/>
+        </w:rPr>
+      </w:pPr>
+      <w:r>
+        <w:rPr>
+          <w:rFonts w:ascii="Times New Roman" w:hAnsi="Times New Roman" w:cs="Times New Roman"/>
+          <w:sz w:val="24"/>
+          <w:szCs w:val="24"/>
+        </w:rPr>
+      </w:r>
+    </w:p>
+    <w:p>
+      <w:pPr>
+        <w:rPr>
+          <w:rFonts w:ascii="Times New Roman" w:hAnsi="Times New Roman" w:cs="Times New Roman"/>
+          <w:sz w:val="24"/>
+          <w:szCs w:val="24"/>
+        </w:rPr>
+      </w:pPr>
+      <w:r>
+        <w:rPr>
+          <w:rFonts w:ascii="Times New Roman" w:hAnsi="Times New Roman" w:cs="Times New Roman"/>
+          <w:sz w:val="24"/>
+          <w:szCs w:val="24"/>
+        </w:rPr>
+      </w:r>
+    </w:p>
+    <w:p>
+      <w:pPr>
+        <w:rPr>
+          <w:rFonts w:ascii="Times New Roman" w:hAnsi="Times New Roman" w:cs="Times New Roman"/>
+          <w:sz w:val="24"/>
+          <w:szCs w:val="24"/>
+        </w:rPr>
+      </w:pPr>
+      <w:r>
+        <w:rPr>
+          <w:rFonts w:ascii="Times New Roman" w:hAnsi="Times New Roman" w:cs="Times New Roman"/>
+          <w:sz w:val="24"/>
+          <w:szCs w:val="24"/>
+        </w:rPr>
+      </w:r>
+    </w:p>
+    <w:p>
+      <w:pPr>
+        <w:rPr>
+          <w:rFonts w:ascii="Times New Roman" w:hAnsi="Times New Roman" w:cs="Times New Roman"/>
+          <w:sz w:val="24"/>
+          <w:szCs w:val="24"/>
+        </w:rPr>
+      </w:pPr>
+      <w:r>
+        <w:rPr>
+          <w:rFonts w:ascii="Times New Roman" w:hAnsi="Times New Roman" w:cs="Times New Roman"/>
+          <w:sz w:val="24"/>
+          <w:szCs w:val="24"/>
+        </w:rPr>
+      </w:r>
+    </w:p>
+    <w:p>
+      <w:pPr>
+        <w:rPr>
+          <w:rFonts w:ascii="Times New Roman" w:hAnsi="Times New Roman" w:cs="Times New Roman"/>
+          <w:sz w:val="24"/>
+          <w:szCs w:val="24"/>
+        </w:rPr>
+      </w:pPr>
+      <w:r>
+        <w:rPr>
+          <w:rFonts w:ascii="Times New Roman" w:hAnsi="Times New Roman" w:cs="Times New Roman"/>
+          <w:sz w:val="24"/>
+          <w:szCs w:val="24"/>
+        </w:rPr>
+      </w:r>
+    </w:p>
+    <w:p>
+      <w:pPr>
+        <w:rPr>
+          <w:rFonts w:ascii="Times New Roman" w:hAnsi="Times New Roman" w:cs="Times New Roman"/>
+          <w:sz w:val="24"/>
+          <w:szCs w:val="24"/>
+        </w:rPr>
+      </w:pPr>
+      <w:r>
+        <w:rPr>
+          <w:rFonts w:ascii="Times New Roman" w:hAnsi="Times New Roman" w:cs="Times New Roman"/>
+          <w:sz w:val="24"/>
+          <w:szCs w:val="24"/>
+        </w:rPr>
+      </w:r>
+    </w:p>
+    <w:p>
+      <w:pPr>
+        <w:rPr>
+          <w:rFonts w:ascii="Times New Roman" w:hAnsi="Times New Roman" w:cs="Times New Roman"/>
+          <w:sz w:val="24"/>
+          <w:szCs w:val="24"/>
+        </w:rPr>
+      </w:pPr>
+      <w:r>
+        <w:rPr>
+          <w:rFonts w:ascii="Times New Roman" w:hAnsi="Times New Roman" w:cs="Times New Roman"/>
+          <w:sz w:val="24"/>
+          <w:szCs w:val="24"/>
+        </w:rPr>
+      </w:r>
+    </w:p>
+    <w:p>
+      <w:pPr>
+        <w:rPr>
+          <w:rFonts w:ascii="Times New Roman" w:hAnsi="Times New Roman" w:cs="Times New Roman"/>
+          <w:sz w:val="24"/>
+          <w:szCs w:val="24"/>
+        </w:rPr>
+      </w:pPr>
+      <w:r>
+        <w:rPr>
+          <w:rFonts w:ascii="Times New Roman" w:hAnsi="Times New Roman" w:cs="Times New Roman"/>
+          <w:sz w:val="24"/>
+          <w:szCs w:val="24"/>
+        </w:rPr>
+      </w:r>
+    </w:p>
+    <w:p>
+      <w:pPr>
+        <w:rPr>
+          <w:rFonts w:ascii="Times New Roman" w:hAnsi="Times New Roman" w:cs="Times New Roman"/>
+          <w:sz w:val="24"/>
+          <w:szCs w:val="24"/>
+        </w:rPr>
+      </w:pPr>
+      <w:r>
+        <w:rPr>
+          <w:rFonts w:ascii="Times New Roman" w:hAnsi="Times New Roman" w:cs="Times New Roman"/>
+          <w:sz w:val="24"/>
+          <w:szCs w:val="24"/>
+        </w:rPr>
+      </w:r>
+    </w:p>
+    <w:p>
+      <w:pPr>
+        <w:rPr>
+          <w:rFonts w:ascii="Times New Roman" w:hAnsi="Times New Roman" w:cs="Times New Roman"/>
+          <w:sz w:val="24"/>
+          <w:szCs w:val="24"/>
+        </w:rPr>
+      </w:pPr>
+      <w:r>
+        <w:rPr>
+          <w:rFonts w:ascii="Times New Roman" w:hAnsi="Times New Roman" w:cs="Times New Roman"/>
+          <w:sz w:val="24"/>
+          <w:szCs w:val="24"/>
+        </w:rPr>
       </w:r>
     </w:p>
     <w:p>
@@ -9245,18 +9255,62 @@
     </w:p>
     <w:p>
       <w:pPr>
-        <w:rPr>
-          <w:rFonts w:ascii="Times New Roman" w:hAnsi="Times New Roman" w:cs="Times New Roman"/>
-          <w:sz w:val="24"/>
-          <w:szCs w:val="24"/>
-        </w:rPr>
-      </w:pPr>
-      <w:r>
-        <w:rPr>
-          <w:rFonts w:ascii="Times New Roman" w:hAnsi="Times New Roman" w:cs="Times New Roman"/>
-          <w:sz w:val="24"/>
-          <w:szCs w:val="24"/>
-        </w:rPr>
+        <w:jc w:val="center"/>
+        <w:rPr>
+          <w:rFonts w:ascii="Times New Roman" w:hAnsi="Times New Roman" w:cs="Times New Roman"/>
+          <w:sz w:val="24"/>
+          <w:szCs w:val="24"/>
+        </w:rPr>
+      </w:pPr>
+      <w:r>
+        <w:rPr>
+          <w:rFonts w:ascii="Times New Roman" w:hAnsi="Times New Roman" w:cs="Times New Roman"/>
+          <w:sz w:val="24"/>
+          <w:szCs w:val="24"/>
+        </w:rPr>
+      </w:r>
+      <w:r>
+        <w:drawing>
+          <wp:inline xmlns:a="http://schemas.openxmlformats.org/drawingml/2006/main" xmlns:pic="http://schemas.openxmlformats.org/drawingml/2006/picture">
+            <wp:extent cx="5715000" cy="3213119"/>
+            <wp:docPr id="2" name="Picture 2"/>
+            <wp:cNvGraphicFramePr>
+              <a:graphicFrameLocks noChangeAspect="1"/>
+            </wp:cNvGraphicFramePr>
+            <a:graphic>
+              <a:graphicData uri="http://schemas.openxmlformats.org/drawingml/2006/picture">
+                <pic:pic>
+                  <pic:nvPicPr>
+                    <pic:cNvPr id="0" name="Screenshot (681).png"/>
+                    <pic:cNvPicPr/>
+                  </pic:nvPicPr>
+                  <pic:blipFill>
+                    <a:blip r:embed="rId12"/>
+                    <a:stretch>
+                      <a:fillRect/>
+                    </a:stretch>
+                  </pic:blipFill>
+                  <pic:spPr>
+                    <a:xfrm>
+                      <a:off x="0" y="0"/>
+                      <a:ext cx="5715000" cy="3213119"/>
+                    </a:xfrm>
+                    <a:prstGeom prst="rect"/>
+                  </pic:spPr>
+                </pic:pic>
+              </a:graphicData>
+            </a:graphic>
+          </wp:inline>
+        </w:drawing>
+      </w:r>
+      <w:r>
+        <w:rPr>
+          <w:b/>
+          <w:i/>
+          <w:sz w:val="18"/>
+        </w:rPr>
+        <w:br/>
+        <w:t>Figure 2. Actual Project FALCON-01 V2 Fusion assembly showing the single-body float, rounded keel, tower, opposed solar panels, and sensor deck.</w:t>
       </w:r>
     </w:p>
     <w:p>
@@ -10265,18 +10319,62 @@
     </w:p>
     <w:p>
       <w:pPr>
-        <w:rPr>
-          <w:rFonts w:ascii="Times New Roman" w:hAnsi="Times New Roman" w:cs="Times New Roman"/>
-          <w:sz w:val="24"/>
-          <w:szCs w:val="24"/>
-        </w:rPr>
-      </w:pPr>
-      <w:r>
-        <w:rPr>
-          <w:rFonts w:ascii="Times New Roman" w:hAnsi="Times New Roman" w:cs="Times New Roman"/>
-          <w:sz w:val="24"/>
-          <w:szCs w:val="24"/>
-        </w:rPr>
+        <w:jc w:val="center"/>
+        <w:rPr>
+          <w:rFonts w:ascii="Times New Roman" w:hAnsi="Times New Roman" w:cs="Times New Roman"/>
+          <w:sz w:val="24"/>
+          <w:szCs w:val="24"/>
+        </w:rPr>
+      </w:pPr>
+      <w:r>
+        <w:rPr>
+          <w:rFonts w:ascii="Times New Roman" w:hAnsi="Times New Roman" w:cs="Times New Roman"/>
+          <w:sz w:val="24"/>
+          <w:szCs w:val="24"/>
+        </w:rPr>
+      </w:r>
+      <w:r>
+        <w:drawing>
+          <wp:inline xmlns:a="http://schemas.openxmlformats.org/drawingml/2006/main" xmlns:pic="http://schemas.openxmlformats.org/drawingml/2006/picture">
+            <wp:extent cx="5715000" cy="3213119"/>
+            <wp:docPr id="3" name="Picture 3"/>
+            <wp:cNvGraphicFramePr>
+              <a:graphicFrameLocks noChangeAspect="1"/>
+            </wp:cNvGraphicFramePr>
+            <a:graphic>
+              <a:graphicData uri="http://schemas.openxmlformats.org/drawingml/2006/picture">
+                <pic:pic>
+                  <pic:nvPicPr>
+                    <pic:cNvPr id="0" name="Screenshot (689).png"/>
+                    <pic:cNvPicPr/>
+                  </pic:nvPicPr>
+                  <pic:blipFill>
+                    <a:blip r:embed="rId13"/>
+                    <a:stretch>
+                      <a:fillRect/>
+                    </a:stretch>
+                  </pic:blipFill>
+                  <pic:spPr>
+                    <a:xfrm>
+                      <a:off x="0" y="0"/>
+                      <a:ext cx="5715000" cy="3213119"/>
+                    </a:xfrm>
+                    <a:prstGeom prst="rect"/>
+                  </pic:spPr>
+                </pic:pic>
+              </a:graphicData>
+            </a:graphic>
+          </wp:inline>
+        </w:drawing>
+      </w:r>
+      <w:r>
+        <w:rPr>
+          <w:b/>
+          <w:i/>
+          <w:sz w:val="18"/>
+        </w:rPr>
+        <w:br/>
+        <w:t>Figure 3. Actual V2 Fusion electronics placement inside the elevated rectangular marine pod.</w:t>
       </w:r>
     </w:p>
     <w:p>
@@ -10929,18 +11027,62 @@
     </w:p>
     <w:p>
       <w:pPr>
-        <w:rPr>
-          <w:rFonts w:ascii="Times New Roman" w:hAnsi="Times New Roman" w:cs="Times New Roman"/>
-          <w:sz w:val="24"/>
-          <w:szCs w:val="24"/>
-        </w:rPr>
-      </w:pPr>
-      <w:r>
-        <w:rPr>
-          <w:rFonts w:ascii="Times New Roman" w:hAnsi="Times New Roman" w:cs="Times New Roman"/>
-          <w:sz w:val="24"/>
-          <w:szCs w:val="24"/>
-        </w:rPr>
+        <w:jc w:val="center"/>
+        <w:rPr>
+          <w:rFonts w:ascii="Times New Roman" w:hAnsi="Times New Roman" w:cs="Times New Roman"/>
+          <w:sz w:val="24"/>
+          <w:szCs w:val="24"/>
+        </w:rPr>
+      </w:pPr>
+      <w:r>
+        <w:rPr>
+          <w:rFonts w:ascii="Times New Roman" w:hAnsi="Times New Roman" w:cs="Times New Roman"/>
+          <w:sz w:val="24"/>
+          <w:szCs w:val="24"/>
+        </w:rPr>
+      </w:r>
+      <w:r>
+        <w:drawing>
+          <wp:inline xmlns:a="http://schemas.openxmlformats.org/drawingml/2006/main" xmlns:pic="http://schemas.openxmlformats.org/drawingml/2006/picture">
+            <wp:extent cx="5715000" cy="3213119"/>
+            <wp:docPr id="4" name="Picture 4"/>
+            <wp:cNvGraphicFramePr>
+              <a:graphicFrameLocks noChangeAspect="1"/>
+            </wp:cNvGraphicFramePr>
+            <a:graphic>
+              <a:graphicData uri="http://schemas.openxmlformats.org/drawingml/2006/picture">
+                <pic:pic>
+                  <pic:nvPicPr>
+                    <pic:cNvPr id="0" name="Screenshot (693).png"/>
+                    <pic:cNvPicPr/>
+                  </pic:nvPicPr>
+                  <pic:blipFill>
+                    <a:blip r:embed="rId14"/>
+                    <a:stretch>
+                      <a:fillRect/>
+                    </a:stretch>
+                  </pic:blipFill>
+                  <pic:spPr>
+                    <a:xfrm>
+                      <a:off x="0" y="0"/>
+                      <a:ext cx="5715000" cy="3213119"/>
+                    </a:xfrm>
+                    <a:prstGeom prst="rect"/>
+                  </pic:spPr>
+                </pic:pic>
+              </a:graphicData>
+            </a:graphic>
+          </wp:inline>
+        </w:drawing>
+      </w:r>
+      <w:r>
+        <w:rPr>
+          <w:b/>
+          <w:i/>
+          <w:sz w:val="18"/>
+        </w:rPr>
+        <w:br/>
+        <w:t>Figure 4. Actual sealed-pod thermal assembly: two internal recirculation fans, component heat sinks, airflow guides, vertical thermal bridge, and rear external finned heat sink.</w:t>
       </w:r>
     </w:p>
     <w:p>
@@ -11845,18 +11987,62 @@
     </w:p>
     <w:p>
       <w:pPr>
-        <w:rPr>
-          <w:rFonts w:ascii="Times New Roman" w:hAnsi="Times New Roman" w:cs="Times New Roman"/>
-          <w:sz w:val="24"/>
-          <w:szCs w:val="24"/>
-        </w:rPr>
-      </w:pPr>
-      <w:r>
-        <w:rPr>
-          <w:rFonts w:ascii="Times New Roman" w:hAnsi="Times New Roman" w:cs="Times New Roman"/>
-          <w:sz w:val="24"/>
-          <w:szCs w:val="24"/>
-        </w:rPr>
+        <w:jc w:val="center"/>
+        <w:rPr>
+          <w:rFonts w:ascii="Times New Roman" w:hAnsi="Times New Roman" w:cs="Times New Roman"/>
+          <w:sz w:val="24"/>
+          <w:szCs w:val="24"/>
+        </w:rPr>
+      </w:pPr>
+      <w:r>
+        <w:rPr>
+          <w:rFonts w:ascii="Times New Roman" w:hAnsi="Times New Roman" w:cs="Times New Roman"/>
+          <w:sz w:val="24"/>
+          <w:szCs w:val="24"/>
+        </w:rPr>
+      </w:r>
+      <w:r>
+        <w:drawing>
+          <wp:inline xmlns:a="http://schemas.openxmlformats.org/drawingml/2006/main" xmlns:pic="http://schemas.openxmlformats.org/drawingml/2006/picture">
+            <wp:extent cx="5715000" cy="4365625"/>
+            <wp:docPr id="5" name="Picture 5"/>
+            <wp:cNvGraphicFramePr>
+              <a:graphicFrameLocks noChangeAspect="1"/>
+            </wp:cNvGraphicFramePr>
+            <a:graphic>
+              <a:graphicData uri="http://schemas.openxmlformats.org/drawingml/2006/picture">
+                <pic:pic>
+                  <pic:nvPicPr>
+                    <pic:cNvPr id="0" name="dashboard-overview.png"/>
+                    <pic:cNvPicPr/>
+                  </pic:nvPicPr>
+                  <pic:blipFill>
+                    <a:blip r:embed="rId15"/>
+                    <a:stretch>
+                      <a:fillRect/>
+                    </a:stretch>
+                  </pic:blipFill>
+                  <pic:spPr>
+                    <a:xfrm>
+                      <a:off x="0" y="0"/>
+                      <a:ext cx="5715000" cy="4365625"/>
+                    </a:xfrm>
+                    <a:prstGeom prst="rect"/>
+                  </pic:spPr>
+                </pic:pic>
+              </a:graphicData>
+            </a:graphic>
+          </wp:inline>
+        </w:drawing>
+      </w:r>
+      <w:r>
+        <w:rPr>
+          <w:b/>
+          <w:i/>
+          <w:sz w:val="18"/>
+        </w:rPr>
+        <w:br/>
+        <w:t>Figure 5. Current Dashboard Next interface for live measurements, wave forecast, sea-condition class, power status, GPS, and system health.</w:t>
       </w:r>
     </w:p>
     <w:p>

</xml_diff>